<commit_message>
Documenta a necessidade do esptool no PATH do Windows na gravação
O procedimento de gravação já orientava copiar o esptool da mídia,
mas só instruía abrir o terminal "na pasta que contém o esptool" —
frágil (não funciona em PowerShell, e depende de sempre abrir o
terminal no lugar certo). Adiciona um passo explícito no Setup de
Gravação (seção 3) para colocar a pasta do esptool no PATH via
`setx`, uma linha na tabela de equipamentos remetendo a esse passo,
e uma linha na tabela de resolução de problemas para o caso de
"esptool não é reconhecido como um comando". docs/README.md também
documenta essa exigência no resumo do procedimento.

Co-Authored-By: Claude Sonnet 5 <noreply@anthropic.com>
Claude-Session: https://claude.ai/code/session_01VvvtJDPvh4mDoSVpkHza1d
</commit_message>
<xml_diff>
--- a/docs/procedimento-gravacao-firmware.docx
+++ b/docs/procedimento-gravacao-firmware.docx
@@ -1252,7 +1252,7 @@
                 <w:sz w:val="21"/>
                 <w:szCs w:val="21"/>
               </w:rPr>
-              <w:t xml:space="preserve">Mídia (DVD ou CD) de gravação, arquivada no repositório físico da fábrica, contendo firmware.bin, bootloader.bin, partitions.bin e o esptool (standalone, para Windows)</w:t>
+              <w:t xml:space="preserve">Mídia (DVD ou CD) de gravação, arquivada no repositório físico da fábrica, contendo firmware.bin, bootloader.bin, partitions.bin e o esptool (standalone, para Windows — deve ficar acessível pelo PATH do Windows, ver seção 3, passo 5)</w:t>
             </w:r>
           </w:p>
         </w:tc>
@@ -1590,6 +1590,57 @@
           <w:szCs w:val="21"/>
         </w:rPr>
         <w:t xml:space="preserve">Conectar o ESP32 ao computador pelo cabo USB e confirmar que o Windows reconheceu a placa como porta serial (COMx, no Gerenciador de Dispositivos). Se a porta não aparecer, ver seção 5 (driver CH9102).</w:t>
+      </w:r>
+    </w:p>
+    <w:p>
+      <w:pPr>
+        <w:spacing w:after="100" w:line="264" w:lineRule="auto"/>
+        <w:ind w:left="500" w:hanging="300"/>
+        <w:jc w:val="both"/>
+      </w:pPr>
+      <w:r>
+        <w:rPr>
+          <w:rFonts w:ascii="Arial" w:cs="Arial" w:eastAsia="Arial" w:hAnsi="Arial"/>
+          <w:b/>
+          <w:bCs/>
+          <w:sz w:val="21"/>
+          <w:szCs w:val="21"/>
+        </w:rPr>
+        <w:t xml:space="preserve">5. </w:t>
+      </w:r>
+      <w:r>
+        <w:rPr>
+          <w:rFonts w:ascii="Arial" w:cs="Arial" w:eastAsia="Arial" w:hAnsi="Arial"/>
+          <w:sz w:val="21"/>
+          <w:szCs w:val="21"/>
+        </w:rPr>
+        <w:t xml:space="preserve">Adicionar a pasta do esptool (copiada da mídia) ao PATH do Windows, ou anotar seu caminho completo — evita ter que abrir o terminal exatamente dentro dessa pasta a cada gravação:</w:t>
+      </w:r>
+    </w:p>
+    <w:p>
+      <w:pPr>
+        <w:spacing w:after="200" w:before="100" w:line="240" w:lineRule="auto"/>
+        <w:ind w:left="300"/>
+      </w:pPr>
+      <w:r>
+        <w:rPr>
+          <w:rFonts w:ascii="Courier New" w:cs="Courier New" w:eastAsia="Courier New" w:hAnsi="Courier New"/>
+          <w:sz w:val="18"/>
+          <w:szCs w:val="18"/>
+        </w:rPr>
+        <w:t xml:space="preserve">setx PATH "%PATH%;C:\caminho\para\esptool"</w:t>
+      </w:r>
+      <w:r>
+        <w:br/>
+        <w:t xml:space="preserve"/>
+      </w:r>
+      <w:r>
+        <w:rPr>
+          <w:rFonts w:ascii="Courier New" w:cs="Courier New" w:eastAsia="Courier New" w:hAnsi="Courier New"/>
+          <w:sz w:val="18"/>
+          <w:szCs w:val="18"/>
+        </w:rPr>
+        <w:t xml:space="preserve">REM abrir um novo terminal depois de rodar o setx, para o PATH novo valer</w:t>
       </w:r>
     </w:p>
     <w:p>
@@ -2818,6 +2869,116 @@
                 <w:szCs w:val="21"/>
               </w:rPr>
               <w:t xml:space="preserve">Instalar o driver oficial "CH9102" da WCH (instalador local, não exige internet)</w:t>
+            </w:r>
+          </w:p>
+        </w:tc>
+      </w:tr>
+      <w:tr>
+        <w:tc>
+          <w:tcPr>
+            <w:tcW w:type="dxa" w:w="2400"/>
+            <w:tcBorders>
+              <w:top w:val="single" w:color="000000" w:sz="4"/>
+              <w:left w:val="single" w:color="000000" w:sz="4"/>
+              <w:bottom w:val="single" w:color="000000" w:sz="4"/>
+              <w:right w:val="single" w:color="000000" w:sz="4"/>
+            </w:tcBorders>
+            <w:tcMar>
+              <w:top w:type="dxa" w:w="60"/>
+              <w:left w:type="dxa" w:w="100"/>
+              <w:bottom w:type="dxa" w:w="60"/>
+              <w:right w:type="dxa" w:w="100"/>
+            </w:tcMar>
+            <w:vAlign w:val="center"/>
+          </w:tcPr>
+          <w:p>
+            <w:pPr>
+              <w:spacing w:line="240" w:lineRule="auto"/>
+              <w:jc w:val="left"/>
+            </w:pPr>
+            <w:r>
+              <w:rPr>
+                <w:rFonts w:ascii="Arial" w:cs="Arial" w:eastAsia="Arial" w:hAnsi="Arial"/>
+                <w:b w:val="false"/>
+                <w:bCs w:val="false"/>
+                <w:i w:val="false"/>
+                <w:iCs w:val="false"/>
+                <w:sz w:val="21"/>
+                <w:szCs w:val="21"/>
+              </w:rPr>
+              <w:t xml:space="preserve">"'esptool' não é reconhecido como um comando..."</w:t>
+            </w:r>
+          </w:p>
+        </w:tc>
+        <w:tc>
+          <w:tcPr>
+            <w:tcW w:type="dxa" w:w="3438"/>
+            <w:tcBorders>
+              <w:top w:val="single" w:color="000000" w:sz="4"/>
+              <w:left w:val="single" w:color="000000" w:sz="4"/>
+              <w:bottom w:val="single" w:color="000000" w:sz="4"/>
+              <w:right w:val="single" w:color="000000" w:sz="4"/>
+            </w:tcBorders>
+            <w:tcMar>
+              <w:top w:type="dxa" w:w="60"/>
+              <w:left w:type="dxa" w:w="100"/>
+              <w:bottom w:type="dxa" w:w="60"/>
+              <w:right w:type="dxa" w:w="100"/>
+            </w:tcMar>
+            <w:vAlign w:val="center"/>
+          </w:tcPr>
+          <w:p>
+            <w:pPr>
+              <w:spacing w:line="240" w:lineRule="auto"/>
+              <w:jc w:val="left"/>
+            </w:pPr>
+            <w:r>
+              <w:rPr>
+                <w:rFonts w:ascii="Arial" w:cs="Arial" w:eastAsia="Arial" w:hAnsi="Arial"/>
+                <w:b w:val="false"/>
+                <w:bCs w:val="false"/>
+                <w:i w:val="false"/>
+                <w:iCs w:val="false"/>
+                <w:sz w:val="21"/>
+                <w:szCs w:val="21"/>
+              </w:rPr>
+              <w:t xml:space="preserve">Pasta do esptool não está no PATH do Windows nem é a pasta atual do terminal</w:t>
+            </w:r>
+          </w:p>
+        </w:tc>
+        <w:tc>
+          <w:tcPr>
+            <w:tcW w:type="dxa" w:w="3800"/>
+            <w:tcBorders>
+              <w:top w:val="single" w:color="000000" w:sz="4"/>
+              <w:left w:val="single" w:color="000000" w:sz="4"/>
+              <w:bottom w:val="single" w:color="000000" w:sz="4"/>
+              <w:right w:val="single" w:color="000000" w:sz="4"/>
+            </w:tcBorders>
+            <w:tcMar>
+              <w:top w:type="dxa" w:w="60"/>
+              <w:left w:type="dxa" w:w="100"/>
+              <w:bottom w:type="dxa" w:w="60"/>
+              <w:right w:type="dxa" w:w="100"/>
+            </w:tcMar>
+            <w:vAlign w:val="center"/>
+          </w:tcPr>
+          <w:p>
+            <w:pPr>
+              <w:spacing w:line="240" w:lineRule="auto"/>
+              <w:jc w:val="left"/>
+            </w:pPr>
+            <w:r>
+              <w:rPr>
+                <w:rFonts w:ascii="Arial" w:cs="Arial" w:eastAsia="Arial" w:hAnsi="Arial"/>
+                <w:b w:val="false"/>
+                <w:bCs w:val="false"/>
+                <w:i w:val="false"/>
+                <w:iCs w:val="false"/>
+                <w:sz w:val="21"/>
+                <w:szCs w:val="21"/>
+              </w:rPr>
+              <w:t xml:space="preserve">Adicionar a pasta ao PATH (seção 3, passo 5) e abrir um novo terminal; ou chamar esptool pelo caminho completo do .exe</w:t>
             </w:r>
           </w:p>
         </w:tc>

</xml_diff>

<commit_message>
Documenta a necessidade do esptool no PATH do Windows na gravação (#29)
O procedimento de gravação já orientava copiar o esptool da mídia,
mas só instruía abrir o terminal "na pasta que contém o esptool" —
frágil (não funciona em PowerShell, e depende de sempre abrir o
terminal no lugar certo). Adiciona um passo explícito no Setup de
Gravação (seção 3) para colocar a pasta do esptool no PATH via
`setx`, uma linha na tabela de equipamentos remetendo a esse passo,
e uma linha na tabela de resolução de problemas para o caso de
"esptool não é reconhecido como um comando". docs/README.md também
documenta essa exigência no resumo do procedimento.


Claude-Session: https://claude.ai/code/session_01VvvtJDPvh4mDoSVpkHza1d

Co-authored-by: Claude <noreply@anthropic.com>
</commit_message>
<xml_diff>
--- a/docs/procedimento-gravacao-firmware.docx
+++ b/docs/procedimento-gravacao-firmware.docx
@@ -1252,7 +1252,7 @@
                 <w:sz w:val="21"/>
                 <w:szCs w:val="21"/>
               </w:rPr>
-              <w:t xml:space="preserve">Mídia (DVD ou CD) de gravação, arquivada no repositório físico da fábrica, contendo firmware.bin, bootloader.bin, partitions.bin e o esptool (standalone, para Windows)</w:t>
+              <w:t xml:space="preserve">Mídia (DVD ou CD) de gravação, arquivada no repositório físico da fábrica, contendo firmware.bin, bootloader.bin, partitions.bin e o esptool (standalone, para Windows — deve ficar acessível pelo PATH do Windows, ver seção 3, passo 5)</w:t>
             </w:r>
           </w:p>
         </w:tc>
@@ -1590,6 +1590,57 @@
           <w:szCs w:val="21"/>
         </w:rPr>
         <w:t xml:space="preserve">Conectar o ESP32 ao computador pelo cabo USB e confirmar que o Windows reconheceu a placa como porta serial (COMx, no Gerenciador de Dispositivos). Se a porta não aparecer, ver seção 5 (driver CH9102).</w:t>
+      </w:r>
+    </w:p>
+    <w:p>
+      <w:pPr>
+        <w:spacing w:after="100" w:line="264" w:lineRule="auto"/>
+        <w:ind w:left="500" w:hanging="300"/>
+        <w:jc w:val="both"/>
+      </w:pPr>
+      <w:r>
+        <w:rPr>
+          <w:rFonts w:ascii="Arial" w:cs="Arial" w:eastAsia="Arial" w:hAnsi="Arial"/>
+          <w:b/>
+          <w:bCs/>
+          <w:sz w:val="21"/>
+          <w:szCs w:val="21"/>
+        </w:rPr>
+        <w:t xml:space="preserve">5. </w:t>
+      </w:r>
+      <w:r>
+        <w:rPr>
+          <w:rFonts w:ascii="Arial" w:cs="Arial" w:eastAsia="Arial" w:hAnsi="Arial"/>
+          <w:sz w:val="21"/>
+          <w:szCs w:val="21"/>
+        </w:rPr>
+        <w:t xml:space="preserve">Adicionar a pasta do esptool (copiada da mídia) ao PATH do Windows, ou anotar seu caminho completo — evita ter que abrir o terminal exatamente dentro dessa pasta a cada gravação:</w:t>
+      </w:r>
+    </w:p>
+    <w:p>
+      <w:pPr>
+        <w:spacing w:after="200" w:before="100" w:line="240" w:lineRule="auto"/>
+        <w:ind w:left="300"/>
+      </w:pPr>
+      <w:r>
+        <w:rPr>
+          <w:rFonts w:ascii="Courier New" w:cs="Courier New" w:eastAsia="Courier New" w:hAnsi="Courier New"/>
+          <w:sz w:val="18"/>
+          <w:szCs w:val="18"/>
+        </w:rPr>
+        <w:t xml:space="preserve">setx PATH "%PATH%;C:\caminho\para\esptool"</w:t>
+      </w:r>
+      <w:r>
+        <w:br/>
+        <w:t xml:space="preserve"/>
+      </w:r>
+      <w:r>
+        <w:rPr>
+          <w:rFonts w:ascii="Courier New" w:cs="Courier New" w:eastAsia="Courier New" w:hAnsi="Courier New"/>
+          <w:sz w:val="18"/>
+          <w:szCs w:val="18"/>
+        </w:rPr>
+        <w:t xml:space="preserve">REM abrir um novo terminal depois de rodar o setx, para o PATH novo valer</w:t>
       </w:r>
     </w:p>
     <w:p>
@@ -2818,6 +2869,116 @@
                 <w:szCs w:val="21"/>
               </w:rPr>
               <w:t xml:space="preserve">Instalar o driver oficial "CH9102" da WCH (instalador local, não exige internet)</w:t>
+            </w:r>
+          </w:p>
+        </w:tc>
+      </w:tr>
+      <w:tr>
+        <w:tc>
+          <w:tcPr>
+            <w:tcW w:type="dxa" w:w="2400"/>
+            <w:tcBorders>
+              <w:top w:val="single" w:color="000000" w:sz="4"/>
+              <w:left w:val="single" w:color="000000" w:sz="4"/>
+              <w:bottom w:val="single" w:color="000000" w:sz="4"/>
+              <w:right w:val="single" w:color="000000" w:sz="4"/>
+            </w:tcBorders>
+            <w:tcMar>
+              <w:top w:type="dxa" w:w="60"/>
+              <w:left w:type="dxa" w:w="100"/>
+              <w:bottom w:type="dxa" w:w="60"/>
+              <w:right w:type="dxa" w:w="100"/>
+            </w:tcMar>
+            <w:vAlign w:val="center"/>
+          </w:tcPr>
+          <w:p>
+            <w:pPr>
+              <w:spacing w:line="240" w:lineRule="auto"/>
+              <w:jc w:val="left"/>
+            </w:pPr>
+            <w:r>
+              <w:rPr>
+                <w:rFonts w:ascii="Arial" w:cs="Arial" w:eastAsia="Arial" w:hAnsi="Arial"/>
+                <w:b w:val="false"/>
+                <w:bCs w:val="false"/>
+                <w:i w:val="false"/>
+                <w:iCs w:val="false"/>
+                <w:sz w:val="21"/>
+                <w:szCs w:val="21"/>
+              </w:rPr>
+              <w:t xml:space="preserve">"'esptool' não é reconhecido como um comando..."</w:t>
+            </w:r>
+          </w:p>
+        </w:tc>
+        <w:tc>
+          <w:tcPr>
+            <w:tcW w:type="dxa" w:w="3438"/>
+            <w:tcBorders>
+              <w:top w:val="single" w:color="000000" w:sz="4"/>
+              <w:left w:val="single" w:color="000000" w:sz="4"/>
+              <w:bottom w:val="single" w:color="000000" w:sz="4"/>
+              <w:right w:val="single" w:color="000000" w:sz="4"/>
+            </w:tcBorders>
+            <w:tcMar>
+              <w:top w:type="dxa" w:w="60"/>
+              <w:left w:type="dxa" w:w="100"/>
+              <w:bottom w:type="dxa" w:w="60"/>
+              <w:right w:type="dxa" w:w="100"/>
+            </w:tcMar>
+            <w:vAlign w:val="center"/>
+          </w:tcPr>
+          <w:p>
+            <w:pPr>
+              <w:spacing w:line="240" w:lineRule="auto"/>
+              <w:jc w:val="left"/>
+            </w:pPr>
+            <w:r>
+              <w:rPr>
+                <w:rFonts w:ascii="Arial" w:cs="Arial" w:eastAsia="Arial" w:hAnsi="Arial"/>
+                <w:b w:val="false"/>
+                <w:bCs w:val="false"/>
+                <w:i w:val="false"/>
+                <w:iCs w:val="false"/>
+                <w:sz w:val="21"/>
+                <w:szCs w:val="21"/>
+              </w:rPr>
+              <w:t xml:space="preserve">Pasta do esptool não está no PATH do Windows nem é a pasta atual do terminal</w:t>
+            </w:r>
+          </w:p>
+        </w:tc>
+        <w:tc>
+          <w:tcPr>
+            <w:tcW w:type="dxa" w:w="3800"/>
+            <w:tcBorders>
+              <w:top w:val="single" w:color="000000" w:sz="4"/>
+              <w:left w:val="single" w:color="000000" w:sz="4"/>
+              <w:bottom w:val="single" w:color="000000" w:sz="4"/>
+              <w:right w:val="single" w:color="000000" w:sz="4"/>
+            </w:tcBorders>
+            <w:tcMar>
+              <w:top w:type="dxa" w:w="60"/>
+              <w:left w:type="dxa" w:w="100"/>
+              <w:bottom w:type="dxa" w:w="60"/>
+              <w:right w:type="dxa" w:w="100"/>
+            </w:tcMar>
+            <w:vAlign w:val="center"/>
+          </w:tcPr>
+          <w:p>
+            <w:pPr>
+              <w:spacing w:line="240" w:lineRule="auto"/>
+              <w:jc w:val="left"/>
+            </w:pPr>
+            <w:r>
+              <w:rPr>
+                <w:rFonts w:ascii="Arial" w:cs="Arial" w:eastAsia="Arial" w:hAnsi="Arial"/>
+                <w:b w:val="false"/>
+                <w:bCs w:val="false"/>
+                <w:i w:val="false"/>
+                <w:iCs w:val="false"/>
+                <w:sz w:val="21"/>
+                <w:szCs w:val="21"/>
+              </w:rPr>
+              <w:t xml:space="preserve">Adicionar a pasta ao PATH (seção 3, passo 5) e abrir um novo terminal; ou chamar esptool pelo caminho completo do .exe</w:t>
             </w:r>
           </w:p>
         </w:tc>

</xml_diff>